<commit_message>
polish final report and strengthen references
</commit_message>
<xml_diff>
--- a/report/36937886.docx
+++ b/report/36937886.docx
@@ -30,13 +30,11 @@
       <w:pPr>
         <w:pStyle w:val="CoverMetadata"/>
       </w:pPr>
-      <w:r/>
     </w:p>
     <w:p>
       <w:pPr>
         <w:pStyle w:val="CoverMetadata"/>
       </w:pPr>
-      <w:r/>
     </w:p>
     <w:p>
       <w:pPr>
@@ -267,7 +265,7 @@
           <w:b w:val="0"/>
           <w:i w:val="0"/>
         </w:rPr>
-        <w:t>Resource scarcity during outbreaks has been studied through other operational decisions. Singh and Rebennack examine whether scarce therapeutic resources should be released immediately or sequentially, connecting epidemic timing to resource allocation (Singh and Rebennack, 2025). The relevance here is the general principle that when demand and health states vary over time, the timing of a resource decision matters. Daily consultation slots similarly need to follow changing pressure rather than being set from a horizon-wide average. Nevertheless, therapeutic release is a different decision from reserving consultation capacity. It involves allocation over time and scarcity of a treatment stock, whereas this project repeats a single-period capacity decision each day. The paper therefore motivates temporal operational reasoning but does not validate the newsvendor formulation, demand assumptions, or cost parameters used below.</w:t>
+        <w:t>Resource scarcity during outbreaks has been studied through other operational decisions. Singh and Rebennack examine whether scarce therapeutic resources should be released immediately or sequentially, connecting epidemic timing to resource allocation (Singh and Rebennack, 2026). The relevance here is the general principle that when demand and health states vary over time, the timing of a resource decision matters. Daily consultation slots similarly need to follow changing pressure rather than being set from a horizon-wide average. Nevertheless, therapeutic release is a different decision from reserving consultation capacity. It involves allocation over time and scarcity of a treatment stock, whereas this project repeats a single-period capacity decision each day. The paper therefore motivates temporal operational reasoning but does not validate the newsvendor formulation, demand assumptions, or cost parameters used below.</w:t>
       </w:r>
     </w:p>
     <w:p>
@@ -277,6 +275,9 @@
           <w:i w:val="0"/>
         </w:rPr>
         <w:t>This distinction prevents two resource questions from being conflated. A release policy asks when and to whom a finite stock should be deployed, potentially carrying resource availability between periods. The model in this report asks how many units of a pooled service to schedule for one day, with no carry-over of unused capacity. The daily decisions form a time-indexed sequence because the demand distribution changes, not because inventory is transferred across days. The implication is that the resulting capacity curve should be read as a set of repeated operating targets. It does not describe a stock-allocation trajectory or a multi-period scheduling programme.</w:t>
+      </w:r>
+      <w:r>
+        <w:t xml:space="preserve"> This scoped abstraction should be viewed alongside broader surge-capacity planning, which emphasizes scalable and flexible responses across facilities and communities when routine resources are exceeded (Hick et al., 2004).</w:t>
       </w:r>
     </w:p>
     <w:p>
@@ -306,6 +307,12 @@
       </w:r>
     </w:p>
     <w:p>
+      <w:pPr/>
+      <w:r>
+        <w:t>Stochastic epidemic modelling can instead introduce randomness within the state-transition process itself, for example through continuous-time Markov chains or stochastic differential equations (Allen, 2017). The present study adopts a narrower coursework extension: it retains the literature-derived deterministic compartment trajectories and places uncertainty in the downstream consultation-demand scenarios. This choice keeps the newsvendor input transparent while avoiding any claim that epidemiological parameter uncertainty has been estimated.</w:t>
+      </w:r>
+    </w:p>
+    <w:p>
       <w:pPr>
         <w:pStyle w:val="Heading2"/>
       </w:pPr>
@@ -319,7 +326,7 @@
           <w:b w:val="0"/>
           <w:i w:val="0"/>
         </w:rPr>
-        <w:t>The literature supplies complementary pieces but not the complete decision chain. Worried-well and outbreak-anxiety research establishes why non-infected concern matters; interacting-process models provide a dynamic representation; outbreak-resource work emphasizes timing; and the newsvendor literature supplies a tractable stochastic capacity rule. None of the six sources directly converts four-compartment worried-well trajectories into optimized daily consultation capacity. This report fills that modelling gap for a coursework case study by linking the components transparently.</w:t>
+        <w:t>The literature supplies complementary pieces but not the complete decision chain. Worried-well and outbreak-anxiety research establishes why non-infected concern matters; interacting-process models provide a dynamic representation; outbreak-resource work emphasizes timing; and the newsvendor literature supplies a tractable stochastic capacity rule. None of these sources directly converts four-compartment worried-well trajectories into optimized daily consultation capacity. This report fills that modelling gap for a coursework case study by linking the components transparently.</w:t>
       </w:r>
     </w:p>
     <w:p>
@@ -3032,10 +3039,54 @@
         <w:pStyle w:val="NarrativeBullet"/>
       </w:pPr>
       <w:r>
-        <w:rPr>
-          <w:b w:val="0"/>
-          <w:i w:val="0"/>
-        </w:rPr>
+        <w:t>Allen, L. J. S. (2017) 'A primer on stochastic epidemic models: Formulation, numerical simulation, and analysis', Infectious Disease Modelling, 2(2), 128-142. https://doi.org/10.1016/j.idm.2017.03.001</w:t>
+      </w:r>
+    </w:p>
+    <w:p>
+      <w:pPr>
+        <w:pStyle w:val="NarrativeBullet"/>
+      </w:pPr>
+      <w:r>
+        <w:t>Asmundson, G. J. G. and Taylor, S. (2020) 'Coronaphobia: fear and the 2019-nCoV outbreak', Journal of Anxiety Disorders, 70, 102196. https://doi.org/10.1016/j.janxdis.2020.102196</w:t>
+      </w:r>
+    </w:p>
+    <w:p>
+      <w:pPr>
+        <w:pStyle w:val="NarrativeBullet"/>
+      </w:pPr>
+      <w:r>
+        <w:t>Blyuss, K. B. and Kyrychko, Y. N. (2005) 'On a basic model of a two-disease epidemic', Applied Mathematics and Computation, 160(1), 177-187. https://doi.org/10.1016/j.amc.2003.10.033</w:t>
+      </w:r>
+    </w:p>
+    <w:p>
+      <w:pPr>
+        <w:pStyle w:val="NarrativeBullet"/>
+      </w:pPr>
+      <w:r>
+        <w:t>Chatterjee, S. S., Vora, M., Malathesh, B. C. and Bhattacharyya, R. (2020) 'Worried well and COVID-19: re-emergence of an old quandary', Asian Journal of Psychiatry, 54, 102247. https://doi.org/10.1016/j.ajp.2020.102247</w:t>
+      </w:r>
+    </w:p>
+    <w:p>
+      <w:pPr>
+        <w:pStyle w:val="NarrativeBullet"/>
+      </w:pPr>
+      <w:r>
+        <w:t>Hick, J. L., Hanfling, D., Burstein, J. L., DeAtley, C., Barbisch, D., Bogdan, G. M. and Cantrill, S. V. (2004) 'Health care facility and community strategies for patient care surge capacity', Annals of Emergency Medicine, 44(3), 253-261. https://doi.org/10.1016/j.annemergmed.2004.04.011</w:t>
+      </w:r>
+    </w:p>
+    <w:p>
+      <w:pPr>
+        <w:pStyle w:val="NarrativeBullet"/>
+      </w:pPr>
+      <w:r>
+        <w:t>Qin, Y., Wang, R., Vakharia, A. J., Chen, Y. and Seref, M. M. H. (2011) 'The newsvendor problem: Review and directions for future research', European Journal of Operational Research, 213(2), 361-374. https://doi.org/10.1016/j.ejor.2010.11.024</w:t>
+      </w:r>
+    </w:p>
+    <w:p>
+      <w:pPr>
+        <w:pStyle w:val="NarrativeBullet"/>
+      </w:pPr>
+      <w:r>
         <w:t>Singh, B. and Gromov, D. (2025) 'Mathematically modeling worried-well behavior during infectious disease outbreaks', PLOS ONE, 20(9), e0319550. https://doi.org/10.1371/journal.pone.0319550</w:t>
       </w:r>
     </w:p>
@@ -3044,59 +3095,7 @@
         <w:pStyle w:val="NarrativeBullet"/>
       </w:pPr>
       <w:r>
-        <w:rPr>
-          <w:b w:val="0"/>
-          <w:i w:val="0"/>
-        </w:rPr>
-        <w:t>Chatterjee, S. S., Vora, M., Malathesh, B. C. and Bhattacharyya, R. (2020) 'Worried well and COVID-19: re-emergence of an old quandary', Asian Journal of Psychiatry, 54, 102247. https://doi.org/10.1016/j.ajp.2020.102247</w:t>
-      </w:r>
-    </w:p>
-    <w:p>
-      <w:pPr>
-        <w:pStyle w:val="NarrativeBullet"/>
-      </w:pPr>
-      <w:r>
-        <w:rPr>
-          <w:b w:val="0"/>
-          <w:i w:val="0"/>
-        </w:rPr>
-        <w:t>Asmundson, G. J. G. and Taylor, S. (2020) 'Coronaphobia: fear and the 2019-nCoV outbreak', Journal of Anxiety Disorders, 70, 102196. https://doi.org/10.1016/j.janxdis.2020.102196</w:t>
-      </w:r>
-    </w:p>
-    <w:p>
-      <w:pPr>
-        <w:pStyle w:val="NarrativeBullet"/>
-      </w:pPr>
-      <w:r>
-        <w:rPr>
-          <w:b w:val="0"/>
-          <w:i w:val="0"/>
-        </w:rPr>
-        <w:t>Blyuss, K. B. and Kyrychko, Y. N. (2005) 'On a basic model of a two-disease epidemic', Applied Mathematics and Computation, 160(1), 177-187. https://doi.org/10.1016/j.amc.2003.10.033</w:t>
-      </w:r>
-    </w:p>
-    <w:p>
-      <w:pPr>
-        <w:pStyle w:val="NarrativeBullet"/>
-      </w:pPr>
-      <w:r>
-        <w:rPr>
-          <w:b w:val="0"/>
-          <w:i w:val="0"/>
-        </w:rPr>
-        <w:t>Singh, B. and Rebennack, S. (2025) 'Release immediately or sequentially? Strategies for allocating scarce therapeutic resources during disease outbreaks', IISE Transactions, 58(4), 489-502. https://doi.org/10.1080/24725854.2025.2525918</w:t>
-      </w:r>
-    </w:p>
-    <w:p>
-      <w:pPr>
-        <w:pStyle w:val="NarrativeBullet"/>
-      </w:pPr>
-      <w:r>
-        <w:rPr>
-          <w:b w:val="0"/>
-          <w:i w:val="0"/>
-        </w:rPr>
-        <w:t>Qin, Y., Wang, R., Vakharia, A. J., Chen, Y. and Seref, M. M. H. (2011) 'The newsvendor problem: Review and directions for future research', European Journal of Operational Research, 213(2), 361-374. https://doi.org/10.1016/j.ejor.2010.11.024</w:t>
+        <w:t>Singh, B. and Rebennack, S. (2026) 'Release immediately or sequentially? Strategies for allocating scarce therapeutic resources during disease outbreaks', IISE Transactions, 58(4), 489-502. https://doi.org/10.1080/24725854.2025.2525918</w:t>
       </w:r>
     </w:p>
     <w:p>
@@ -3222,7 +3221,7 @@
         <w:pStyle w:val="ReproducibilityCommand"/>
       </w:pPr>
       <w:r>
-        <w:t>D:\ProgramData\anaconda3\python.exe scripts/validate_report_sources.py</w:t>
+        <w:t>python scripts/validate_report_sources.py</w:t>
       </w:r>
     </w:p>
     <w:sectPr>

</xml_diff>

<commit_message>
remove optional reproducibility appendix
</commit_message>
<xml_diff>
--- a/report/36937886.docx
+++ b/report/36937886.docx
@@ -274,10 +274,7 @@
           <w:b w:val="0"/>
           <w:i w:val="0"/>
         </w:rPr>
-        <w:t>This distinction prevents two resource questions from being conflated. A release policy asks when and to whom a finite stock should be deployed, potentially carrying resource availability between periods. The model in this report asks how many units of a pooled service to schedule for one day, with no carry-over of unused capacity. The daily decisions form a time-indexed sequence because the demand distribution changes, not because inventory is transferred across days. The implication is that the resulting capacity curve should be read as a set of repeated operating targets. It does not describe a stock-allocation trajectory or a multi-period scheduling programme.</w:t>
-      </w:r>
-      <w:r>
-        <w:t xml:space="preserve"> This scoped abstraction should be viewed alongside broader surge-capacity planning, which emphasizes scalable and flexible responses across facilities and communities when routine resources are exceeded (Hick et al., 2004).</w:t>
+        <w:t>This distinction prevents two resource questions from being conflated. A release policy asks when and to whom a finite stock should be deployed, potentially carrying resource availability between periods. The model in this report asks how many units of a pooled service to schedule for one day, with no carry-over of unused capacity. The daily decisions form a time-indexed sequence because the demand distribution changes, not because inventory is transferred across days. The implication is that the resulting capacity curve should be read as a set of repeated operating targets. It does not describe a stock-allocation trajectory or a multi-period scheduling programme. This scoped abstraction should be viewed alongside broader surge-capacity planning, which emphasizes scalable and flexible responses across facilities and communities when routine resources are exceeded (Hick et al., 2004).</w:t>
       </w:r>
     </w:p>
     <w:p>
@@ -307,8 +304,11 @@
       </w:r>
     </w:p>
     <w:p>
-      <w:pPr/>
       <w:r>
+        <w:rPr>
+          <w:b w:val="0"/>
+          <w:i w:val="0"/>
+        </w:rPr>
         <w:t>Stochastic epidemic modelling can instead introduce randomness within the state-transition process itself, for example through continuous-time Markov chains or stochastic differential equations (Allen, 2017). The present study adopts a narrower coursework extension: it retains the literature-derived deterministic compartment trajectories and places uncertainty in the downstream consultation-demand scenarios. This choice keeps the newsvendor input transparent while avoiding any claim that epidemiological parameter uncertainty has been estimated.</w:t>
       </w:r>
     </w:p>
@@ -3039,96 +3039,11 @@
         <w:pStyle w:val="NarrativeBullet"/>
       </w:pPr>
       <w:r>
-        <w:t>Allen, L. J. S. (2017) 'A primer on stochastic epidemic models: Formulation, numerical simulation, and analysis', Infectious Disease Modelling, 2(2), 128-142. https://doi.org/10.1016/j.idm.2017.03.001</w:t>
-      </w:r>
-    </w:p>
-    <w:p>
-      <w:pPr>
-        <w:pStyle w:val="NarrativeBullet"/>
-      </w:pPr>
-      <w:r>
-        <w:t>Asmundson, G. J. G. and Taylor, S. (2020) 'Coronaphobia: fear and the 2019-nCoV outbreak', Journal of Anxiety Disorders, 70, 102196. https://doi.org/10.1016/j.janxdis.2020.102196</w:t>
-      </w:r>
-    </w:p>
-    <w:p>
-      <w:pPr>
-        <w:pStyle w:val="NarrativeBullet"/>
-      </w:pPr>
-      <w:r>
-        <w:t>Blyuss, K. B. and Kyrychko, Y. N. (2005) 'On a basic model of a two-disease epidemic', Applied Mathematics and Computation, 160(1), 177-187. https://doi.org/10.1016/j.amc.2003.10.033</w:t>
-      </w:r>
-    </w:p>
-    <w:p>
-      <w:pPr>
-        <w:pStyle w:val="NarrativeBullet"/>
-      </w:pPr>
-      <w:r>
-        <w:t>Chatterjee, S. S., Vora, M., Malathesh, B. C. and Bhattacharyya, R. (2020) 'Worried well and COVID-19: re-emergence of an old quandary', Asian Journal of Psychiatry, 54, 102247. https://doi.org/10.1016/j.ajp.2020.102247</w:t>
-      </w:r>
-    </w:p>
-    <w:p>
-      <w:pPr>
-        <w:pStyle w:val="NarrativeBullet"/>
-      </w:pPr>
-      <w:r>
-        <w:t>Hick, J. L., Hanfling, D., Burstein, J. L., DeAtley, C., Barbisch, D., Bogdan, G. M. and Cantrill, S. V. (2004) 'Health care facility and community strategies for patient care surge capacity', Annals of Emergency Medicine, 44(3), 253-261. https://doi.org/10.1016/j.annemergmed.2004.04.011</w:t>
-      </w:r>
-    </w:p>
-    <w:p>
-      <w:pPr>
-        <w:pStyle w:val="NarrativeBullet"/>
-      </w:pPr>
-      <w:r>
-        <w:t>Qin, Y., Wang, R., Vakharia, A. J., Chen, Y. and Seref, M. M. H. (2011) 'The newsvendor problem: Review and directions for future research', European Journal of Operational Research, 213(2), 361-374. https://doi.org/10.1016/j.ejor.2010.11.024</w:t>
-      </w:r>
-    </w:p>
-    <w:p>
-      <w:pPr>
-        <w:pStyle w:val="NarrativeBullet"/>
-      </w:pPr>
-      <w:r>
-        <w:t>Singh, B. and Gromov, D. (2025) 'Mathematically modeling worried-well behavior during infectious disease outbreaks', PLOS ONE, 20(9), e0319550. https://doi.org/10.1371/journal.pone.0319550</w:t>
-      </w:r>
-    </w:p>
-    <w:p>
-      <w:pPr>
-        <w:pStyle w:val="NarrativeBullet"/>
-      </w:pPr>
-      <w:r>
-        <w:t>Singh, B. and Rebennack, S. (2026) 'Release immediately or sequentially? Strategies for allocating scarce therapeutic resources during disease outbreaks', IISE Transactions, 58(4), 489-502. https://doi.org/10.1080/24725854.2025.2525918</w:t>
-      </w:r>
-    </w:p>
-    <w:p>
-      <w:pPr>
-        <w:spacing w:after="0"/>
-      </w:pPr>
-      <w:r>
-        <w:br w:type="page"/>
-      </w:r>
-    </w:p>
-    <w:p>
-      <w:pPr>
-        <w:pStyle w:val="Heading1"/>
-      </w:pPr>
-      <w:r>
-        <w:t>Appendix A. Reproducibility</w:t>
-      </w:r>
-    </w:p>
-    <w:p>
-      <w:r>
         <w:rPr>
           <w:b w:val="0"/>
           <w:i w:val="0"/>
         </w:rPr>
-        <w:t>Regenerate the complete evidence set from the repository root with:</w:t>
-      </w:r>
-    </w:p>
-    <w:p>
-      <w:pPr>
-        <w:pStyle w:val="ReproducibilityCommand"/>
-      </w:pPr>
-      <w:r>
-        <w:t>python scripts/run_analysis.py</w:t>
+        <w:t>Allen, L. J. S. (2017) 'A primer on stochastic epidemic models: Formulation, numerical simulation, and analysis', Infectious Disease Modelling, 2(2), 128-142. https://doi.org/10.1016/j.idm.2017.03.001</w:t>
       </w:r>
     </w:p>
     <w:p>
@@ -3140,7 +3055,7 @@
           <w:b w:val="0"/>
           <w:i w:val="0"/>
         </w:rPr>
-        <w:t>in-sample seed = 6186</w:t>
+        <w:t>Asmundson, G. J. G. and Taylor, S. (2020) 'Coronaphobia: fear and the 2019-nCoV outbreak', Journal of Anxiety Disorders, 70, 102196. https://doi.org/10.1016/j.janxdis.2020.102196</w:t>
       </w:r>
     </w:p>
     <w:p>
@@ -3152,7 +3067,7 @@
           <w:b w:val="0"/>
           <w:i w:val="0"/>
         </w:rPr>
-        <w:t>out-of-sample seed = 6187</w:t>
+        <w:t>Blyuss, K. B. and Kyrychko, Y. N. (2005) 'On a basic model of a two-disease epidemic', Applied Mathematics and Computation, 160(1), 177-187. https://doi.org/10.1016/j.amc.2003.10.033</w:t>
       </w:r>
     </w:p>
     <w:p>
@@ -3164,7 +3079,7 @@
           <w:b w:val="0"/>
           <w:i w:val="0"/>
         </w:rPr>
-        <w:t>in-sample scenarios = 5,000</w:t>
+        <w:t>Chatterjee, S. S., Vora, M., Malathesh, B. C. and Bhattacharyya, R. (2020) 'Worried well and COVID-19: re-emergence of an old quandary', Asian Journal of Psychiatry, 54, 102247. https://doi.org/10.1016/j.ajp.2020.102247</w:t>
       </w:r>
     </w:p>
     <w:p>
@@ -3176,52 +3091,43 @@
           <w:b w:val="0"/>
           <w:i w:val="0"/>
         </w:rPr>
-        <w:t>out-of-sample scenarios = 10,000</w:t>
+        <w:t>Hick, J. L., Hanfling, D., Burstein, J. L., DeAtley, C., Barbisch, D., Bogdan, G. M. and Cantrill, S. V. (2004) 'Health care facility and community strategies for patient care surge capacity', Annals of Emergency Medicine, 44(3), 253-261. https://doi.org/10.1016/j.annemergmed.2004.04.011</w:t>
       </w:r>
     </w:p>
     <w:p>
+      <w:pPr>
+        <w:pStyle w:val="NarrativeBullet"/>
+      </w:pPr>
       <w:r>
         <w:rPr>
           <w:b w:val="0"/>
           <w:i w:val="0"/>
         </w:rPr>
-        <w:t xml:space="preserve">The generated contract consists of four CSV files in </w:t>
+        <w:t>Qin, Y., Wang, R., Vakharia, A. J., Chen, Y. and Seref, M. M. H. (2011) 'The newsvendor problem: Review and directions for future research', European Journal of Operational Research, 213(2), 361-374. https://doi.org/10.1016/j.ejor.2010.11.024</w:t>
       </w:r>
+    </w:p>
+    <w:p>
+      <w:pPr>
+        <w:pStyle w:val="NarrativeBullet"/>
+      </w:pPr>
       <w:r>
         <w:rPr>
           <w:b w:val="0"/>
           <w:i w:val="0"/>
         </w:rPr>
-        <w:t>outputs/data</w:t>
+        <w:t>Singh, B. and Gromov, D. (2025) 'Mathematically modeling worried-well behavior during infectious disease outbreaks', PLOS ONE, 20(9), e0319550. https://doi.org/10.1371/journal.pone.0319550</w:t>
       </w:r>
+    </w:p>
+    <w:p>
+      <w:pPr>
+        <w:pStyle w:val="NarrativeBullet"/>
+      </w:pPr>
       <w:r>
         <w:rPr>
           <w:b w:val="0"/>
           <w:i w:val="0"/>
         </w:rPr>
-        <w:t xml:space="preserve"> and five PNG files in </w:t>
-      </w:r>
-      <w:r>
-        <w:rPr>
-          <w:b w:val="0"/>
-          <w:i w:val="0"/>
-        </w:rPr>
-        <w:t>outputs/figures</w:t>
-      </w:r>
-      <w:r>
-        <w:rPr>
-          <w:b w:val="0"/>
-          <w:i w:val="0"/>
-        </w:rPr>
-        <w:t>. Validate source integrity before building the document with:</w:t>
-      </w:r>
-    </w:p>
-    <w:p>
-      <w:pPr>
-        <w:pStyle w:val="ReproducibilityCommand"/>
-      </w:pPr>
-      <w:r>
-        <w:t>python scripts/validate_report_sources.py</w:t>
+        <w:t>Singh, B. and Rebennack, S. (2026) 'Release immediately or sequentially? Strategies for allocating scarce therapeutic resources during disease outbreaks', IISE Transactions, 58(4), 489-502. https://doi.org/10.1080/24725854.2025.2525918</w:t>
       </w:r>
     </w:p>
     <w:sectPr>

</xml_diff>

<commit_message>
polish report prose and pagination
</commit_message>
<xml_diff>
--- a/report/36937886.docx
+++ b/report/36937886.docx
@@ -179,7 +179,7 @@
           <w:b w:val="0"/>
           <w:i w:val="0"/>
         </w:rPr>
-        <w:t>The scope is deliberately narrow. The generated trajectories are not empirical prevalence estimates, and the consultation model is not calibrated to a particular provider. Costs express planning priorities rather than monetary valuations. The contribution is instead methodological and operational: it shows how an explicitly represented worried-well process can alter the timing, scale, and uncertainty buffer of consultation capacity, while preserving a complete evidence trail from implemented equations and saved scenario outputs to each reported result.</w:t>
+        <w:t>The generated trajectories are not empirical prevalence estimates, and the consultation model is not calibrated to a particular provider. Costs express planning priorities rather than monetary valuations. The report instead shows how an explicitly represented worried-well process can alter the timing, scale, and uncertainty buffer of consultation capacity, with each result linked to the implemented equations and saved scenario outputs.</w:t>
       </w:r>
     </w:p>
     <w:p>
@@ -204,7 +204,7 @@
           <w:b w:val="0"/>
           <w:i w:val="0"/>
         </w:rPr>
-        <w:t>The worried-well concept sits between psychological response and healthcare operations. Chatterjee et al. discuss its re-emergence during COVID-19 and establish why apparently healthy but concerned people can be relevant to healthcare systems (Chatterjee et al., 2020). For this report, the important inference is not that every concerned individual requests a consultation. It is that a non-infected population can generate service demand, so infection counts and consultation pressure need not coincide. A resource model that ignores that channel risks treating all requests as a direct consequence of infection. Equally, the cited article is a conceptual clinical discussion rather than an optimization study. It provides motivation for representing worried-well demand but supplies neither the capacity rule nor numerical service-seeking inputs used here.</w:t>
+        <w:t>The worried-well concept links psychological response with healthcare operations. Chatterjee et al. discuss its re-emergence during COVID-19 and explain why apparently healthy but concerned people can affect healthcare systems (Chatterjee et al., 2020). The relevant inference is that a non-infected population can generate service demand, so infection counts and consultation pressure need not coincide. The article motivates this demand channel but, as a conceptual clinical discussion rather than an optimization study, supplies neither the capacity rule nor the numerical service-seeking inputs used here.</w:t>
       </w:r>
     </w:p>
     <w:p>
@@ -213,7 +213,7 @@
           <w:b w:val="0"/>
           <w:i w:val="0"/>
         </w:rPr>
-        <w:t>Asmundson and Taylor place fear and anxiety within the context of an emerging outbreak, supporting the idea that perceived risk can influence behaviour (Asmundson and Taylor, 2020). This perspective helps explain why worried-well prevalence can evolve alongside the infection process: concern may spread through social interaction and perceived exposure, then diminish as people leave the worried state. In operational terms, the psychological process can shift demand earlier than an infection-only workload model would suggest. However, the source does not provide a compartmental resource-planning model. It cannot by itself determine the magnitude of worried-well consultation requests, a stochastic demand distribution, or a capacity decision. Those elements remain explicit modelling choices in this project.</w:t>
+        <w:t>Asmundson and Taylor place fear and anxiety within the context of an emerging outbreak, supporting the idea that perceived risk can influence behaviour (Asmundson and Taylor, 2020). This perspective helps explain why worried-well prevalence can evolve alongside infection: concern may spread through social interaction and perceived exposure, then diminish as people leave the worried state. The resulting demand can arise earlier than an infection-only workload model suggests. The source does not specify a compartmental resource-planning model, consultation volumes, a stochastic demand distribution, or a capacity decision; these remain explicit modelling choices in this project.</w:t>
       </w:r>
     </w:p>
     <w:p>
@@ -335,7 +335,7 @@
           <w:b w:val="0"/>
           <w:i w:val="0"/>
         </w:rPr>
-        <w:t xml:space="preserve">The synthesis is intentionally critical. Literature-derived elements are limited to the four-compartment structure, behavioural alpha regimes, baseline rates and initial condition, plus the classical critical-fractile logic. The synthetic population size, consultation probabilities, coefficient of variation, mismatch costs, scenario counts, and sensitivity settings are coursework assumptions. As a result, the experiment can answer how capacity behaves </w:t>
+        <w:t xml:space="preserve">Literature-derived elements are limited to the four-compartment structure, behavioural alpha regimes, baseline rates and initial condition, and the classical critical-fractile logic. The synthetic population size, consultation probabilities, coefficient of variation, mismatch costs, scenario counts, and sensitivity settings are coursework assumptions. The experiment therefore explains how capacity behaves </w:t>
       </w:r>
       <w:r>
         <w:rPr>
@@ -349,7 +349,7 @@
           <w:b w:val="0"/>
           <w:i w:val="0"/>
         </w:rPr>
-        <w:t xml:space="preserve"> but cannot establish what a real provider should schedule without local estimation and a richer service representation.</w:t>
+        <w:t>; a real schedule would require local estimation and a richer service representation.</w:t>
       </w:r>
     </w:p>
     <w:p>
@@ -465,6 +465,7 @@
           </w:tcPr>
           <w:p>
             <w:pPr>
+              <w:keepNext/>
               <w:keepLines/>
               <w:spacing w:before="0" w:after="0" w:line="240" w:lineRule="auto"/>
               <w:jc w:val="left"/>
@@ -493,6 +494,7 @@
           </w:tcPr>
           <w:p>
             <w:pPr>
+              <w:keepNext/>
               <w:keepLines/>
               <w:spacing w:before="0" w:after="0" w:line="240" w:lineRule="auto"/>
               <w:jc w:val="center"/>
@@ -521,6 +523,7 @@
           </w:tcPr>
           <w:p>
             <w:pPr>
+              <w:keepNext/>
               <w:keepLines/>
               <w:spacing w:before="0" w:after="0" w:line="240" w:lineRule="auto"/>
               <w:jc w:val="left"/>
@@ -1697,7 +1700,7 @@
           <w:b w:val="0"/>
           <w:i w:val="0"/>
         </w:rPr>
-        <w:t>Mean matching matters near the non-negative boundary. Simply truncating a conventional normal distribution at zero would lift its mean above the requested value, which would confound structural demand with an artefact of the distributional transformation. Solving for the pre-truncation location avoids that systematic shift. Stochastic integerization then translates continuous draws into count-valued requests without always rounding down or up. Zero conditional mean is handled directly as zero demand. Together, these choices make scenario averages target the demand equation while retaining non-negativity and integer units.</w:t>
+        <w:t>Mean matching matters near the non-negative boundary because simply truncating a conventional normal distribution at zero would raise its mean above the requested value. Solving for the pre-truncation location avoids that shift. Stochastic integerization then produces count-valued requests without systematically rounding in one direction, while zero conditional mean is handled as zero demand. Scenario averages consequently target the demand equation while remaining non-negative and integer-valued.</w:t>
       </w:r>
     </w:p>
     <w:p>
@@ -1794,7 +1797,7 @@
           <w:b w:val="0"/>
           <w:i w:val="0"/>
         </w:rPr>
-        <w:t>The order-statistic rule is also a sample-average optimizer for the piecewise-linear loss. Candidate capacity increases trade one unit of expected shortage against one unit of expected unused capacity. At the critical fractile, the accumulated scenario probability below capacity is sufficient for the marginal overage consequence to balance the marginal underage consequence. Because realized demand is integer-valued, adjacent capacities can occasionally have very similar costs. The selected in-sample quantile is thus an operating target conditional on one generated sample, not a claim of a unique continuous optimum.</w:t>
+        <w:t>The order-statistic rule minimizes the sample-average piecewise-linear loss by balancing the marginal consequences of shortage and unused capacity at the critical fractile. Because demand is integer-valued, adjacent capacities can have very similar costs. The selected in-sample quantile is therefore an operating target conditional on one generated sample, not a unique continuous optimum.</w:t>
       </w:r>
     </w:p>
     <w:p>
@@ -1812,7 +1815,7 @@
           <w:b w:val="0"/>
           <w:i w:val="0"/>
         </w:rPr>
-        <w:t>Out-of-sample evaluation reduces the risk of crediting a policy for adapting to random features of its optimization draw. Using identical evaluation scenarios for optimized and mean policies further makes the comparison paired: each rule faces the same daily demand realizations. The reported difference can still vary with the finite samples, especially when costs are balanced and the two rules select nearby capacities. For that reason, the sign and magnitude of every comparison are retained as generated.</w:t>
+        <w:t>Out-of-sample evaluation reduces the risk of crediting a policy for random features of its optimization draw. The comparison is paired because the optimized and mean policies face identical evaluation scenarios. Finite-sample differences can still vary, especially under balanced costs when the rules select nearby capacities, so the reported signs and magnitudes are retained as generated.</w:t>
       </w:r>
     </w:p>
     <w:p>
@@ -1856,7 +1859,7 @@
           <w:b w:val="0"/>
           <w:i w:val="0"/>
         </w:rPr>
-        <w:t>Only the parameter named by an experiment group is varied from its baseline, apart from the deliberate alpha crossing in the uncertainty group. This controlled construction supports attribution within the model: differences between cost rows arise from costs, while differences between service-seeking rows arise from the demand mapping. It does not remove interactions that were not included in the grid, so conclusions should remain tied to the tested settings.</w:t>
+        <w:t>Only the parameter named by an experiment group varies from its baseline, apart from the deliberate alpha crossing in the uncertainty group. This design supports attribution within the tested grid: differences between cost rows arise from costs, while differences between service-seeking rows arise from the demand mapping. Untested interactions remain outside the conclusions.</w:t>
       </w:r>
     </w:p>
     <w:p>
@@ -1865,7 +1868,7 @@
           <w:b w:val="0"/>
           <w:i w:val="0"/>
         </w:rPr>
-        <w:t>The design is comparative rather than inferential. It explores controlled scenarios and reports finite-sample expected performance within the implemented distribution. No confidence claim is made about a healthcare population. The figures provide qualitative readings, while numeric statements in the Results are linked to saved summary rows. This separation makes it possible to distinguish conclusions supported by generated evidence from assumptions that would require local validation before operational use.</w:t>
+        <w:t>The design is comparative rather than inferential: it reports finite-sample expected performance within the implemented distribution and makes no confidence claim about a healthcare population. Numeric statements in the Results are linked to saved summary rows, separating generated evidence from assumptions that require local validation.</w:t>
       </w:r>
     </w:p>
     <w:p>
@@ -1890,7 +1893,7 @@
           <w:b w:val="0"/>
           <w:i w:val="0"/>
         </w:rPr>
-        <w:t>Behaviour changes both the height and timing of the two active compartments. In the cautious regime, the infected fraction peaks at 0.545 on day 14, while the worried-well fraction peaks earlier at 0.503 on day 7. Under default behaviour, the corresponding infected peak is 0.678 on day 11, and under high contact it is 0.764 on day 8. The figure should be read horizontally as a timing comparison and vertically as a comparison of model fractions. Higher alpha brings a larger infected peak forward while compressing the worried-well episode; lower alpha delays infected pressure and leaves a more persistent worried-well contribution. These are deterministic scenario fractions, not measured prevalence.</w:t>
+        <w:t>Behaviour changes both the height and timing of the two active compartments. In the cautious regime, the infected fraction peaks at 0.545 on day 14, while the worried-well fraction peaks earlier at 0.503 on day 7. Under default behaviour, the corresponding infected peak is 0.678 on day 11, and under high contact it is 0.764 on day 8. The curves compare timing horizontally and model fractions vertically. Higher alpha brings a larger infected peak forward while compressing the worried-well episode; lower alpha delays infected pressure and leaves a more persistent worried-well contribution. These comparisons concern deterministic scenario fractions, not measured prevalence.</w:t>
       </w:r>
     </w:p>
     <w:p>
@@ -1984,7 +1987,7 @@
           <w:b w:val="0"/>
           <w:i w:val="0"/>
         </w:rPr>
-        <w:t xml:space="preserve">The worried-well-to-infected ratio clarifies why an infection-only staffing signal is incomplete. All three generated paths move above the reference value of one early in the horizon, meaning that the worried-well compartment temporarily exceeds the infected compartment. The cautious path remains above one longer and reaches the highest relative separation; the high-contact path crosses back sooner as infection accelerates. The ratio is useful for reading </w:t>
+        <w:t xml:space="preserve">The worried-well-to-infected ratio clarifies why an infection-only staffing signal is incomplete. All three generated paths move above one early in the horizon, so the worried-well compartment temporarily exceeds the infected compartment. The cautious path remains above one longer and reaches the highest relative separation; the high-contact path crosses back sooner as infection accelerates. This conditional model ratio describes </w:t>
       </w:r>
       <w:r>
         <w:rPr>
@@ -1998,7 +2001,7 @@
           <w:b w:val="0"/>
           <w:i w:val="0"/>
         </w:rPr>
-        <w:t>, not absolute workload: consultation pressure also depends on the synthetic population and different service-seeking probabilities. It is a conditional model ratio, not a measured ratio of arriving service users.</w:t>
+        <w:t>, not absolute workload or the observed mix of service users; consultation pressure also depends on population size and service-seeking probabilities.</w:t>
       </w:r>
     </w:p>
     <w:p>
@@ -2305,7 +2308,7 @@
           <w:b w:val="0"/>
           <w:i w:val="0"/>
         </w:rPr>
-        <w:t>The right-hand panel of Figure 5 answers the cost component of the research question. When underage and overage costs are balanced, the optimized quantile and mean benchmark are close for the modelled distribution. Increasing the underage penalty shifts the critical fractile upward, creating more safety capacity and reducing exposure to shortage. The relative advantage of the optimized policy consequently grows: at c_u=10, the signed relative reduction is 59.11 percent. Read the right panel as a comparison of policy rules under fixed c_o=1, not as evidence that the chosen ratios are economically correct. Both axes depend on assumed linear costs, and the plotted percentage is a finite-sample out-of-sample comparison.</w:t>
+        <w:t>In the right-hand cost-sensitivity panel, balanced underage and overage costs place the optimized quantile close to the mean benchmark for the modelled distribution. Increasing the underage penalty shifts the critical fractile upward, adding safety capacity and reducing exposure to shortage. The relative advantage of the optimized policy consequently grows: at c_u=10, the signed relative reduction is 59.11 percent. This finite-sample comparison fixes c_o=1 and assumes linear costs; it does not establish that the chosen ratios are economically correct.</w:t>
       </w:r>
     </w:p>
     <w:p>
@@ -2433,7 +2436,7 @@
           <w:b w:val="0"/>
           <w:i w:val="0"/>
         </w:rPr>
-        <w:t>For default behaviour and baseline costs, the optimized policy has aggregate out-of-sample cost 345,863.9 cost units, compared with 553,645.1 for rounded mean-demand planning. The signed relative reduction is 37.53 percent. This comparison answers the central policy question: when shortage is more consequential than unused capacity, consultation targets should sit above mean demand by an uncertainty buffer determined by the cost ratio.</w:t>
+        <w:t>For default behaviour and baseline costs, the optimized policy has aggregate out-of-sample cost 345,863.9 cost units, compared with 553,645.1 for rounded mean-demand planning. The signed relative reduction is 37.53 percent. When shortage is more consequential than unused capacity, consultation targets should therefore sit above mean demand by an uncertainty buffer determined by the cost ratio.</w:t>
       </w:r>
     </w:p>
     <w:tbl>
@@ -2469,6 +2472,7 @@
           </w:tcPr>
           <w:p>
             <w:pPr>
+              <w:keepNext/>
               <w:keepLines/>
               <w:spacing w:before="0" w:after="0" w:line="240" w:lineRule="auto"/>
               <w:jc w:val="left"/>
@@ -2497,6 +2501,7 @@
           </w:tcPr>
           <w:p>
             <w:pPr>
+              <w:keepNext/>
               <w:keepLines/>
               <w:spacing w:before="0" w:after="0" w:line="240" w:lineRule="auto"/>
               <w:jc w:val="center"/>
@@ -2525,6 +2530,7 @@
           </w:tcPr>
           <w:p>
             <w:pPr>
+              <w:keepNext/>
               <w:keepLines/>
               <w:spacing w:before="0" w:after="0" w:line="240" w:lineRule="auto"/>
               <w:jc w:val="center"/>
@@ -2553,6 +2559,7 @@
           </w:tcPr>
           <w:p>
             <w:pPr>
+              <w:keepNext/>
               <w:keepLines/>
               <w:spacing w:before="0" w:after="0" w:line="240" w:lineRule="auto"/>
               <w:jc w:val="left"/>
@@ -2913,7 +2920,7 @@
           <w:b w:val="0"/>
           <w:i w:val="0"/>
         </w:rPr>
-        <w:t xml:space="preserve">The balanced-cost edge case must be interpreted differently. Its signed relative difference is -0.0131 percent, which is negative. The optimized finite-sample median policy performed very slightly worse than the rounded mean policy on the independent evaluation draw. The sign is preserved rather than clamped to zero, and the result is not described as an improvement. It is consistent with near-equivalent decision rules plus sampling variation, not evidence of a substantive disadvantage. At the higher shortage penalty, by contrast, the separation between the critical-fractile policy and the mean is operationally meaningful. Overall, behaviour determines </w:t>
+        <w:t xml:space="preserve">The balanced-cost result is -0.0131 percent and is negative: on the independent evaluation draw, the optimized finite-sample median policy performed very slightly worse than the rounded mean policy. The sign is retained rather than clamped to zero. Because the two rules are nearly equivalent under balanced costs, this result is consistent with sampling variation rather than a substantive disadvantage. At the higher shortage penalty, by contrast, the critical-fractile policy separates meaningfully from the mean. Overall, behaviour determines </w:t>
       </w:r>
       <w:r>
         <w:rPr>
@@ -2927,7 +2934,7 @@
           <w:b w:val="0"/>
           <w:i w:val="0"/>
         </w:rPr>
-        <w:t xml:space="preserve"> capacity is required, uncertainty determines the size and cost of mismatch, and the cost ratio determines how far capacity should be moved toward shortage protection.</w:t>
+        <w:t xml:space="preserve"> capacity is required, uncertainty determines the size and cost of mismatch, and the cost ratio determines how far capacity should move toward shortage protection.</w:t>
       </w:r>
     </w:p>
     <w:p>
@@ -2944,7 +2951,7 @@
           <w:b w:val="0"/>
           <w:i w:val="0"/>
         </w:rPr>
-        <w:t>The experiments answer the research question in three linked parts. First, daily consultation capacity should track the combined infected and worried-well demand process rather than the infected curve alone. Behavioural contact changes not only the peak infected fraction but also the timing and persistence of worried-well pressure. A cautious scenario can therefore require a lower but broader capacity response, while a high-contact scenario requires an earlier and sharper response. The ratio figure reinforces that non-infected concern can dominate the modelled state composition early, even though its contribution to demand is discounted by the baseline service probability.</w:t>
+        <w:t>Daily consultation capacity should track the combined infected and worried-well demand process rather than the infected curve alone. Behavioural contact changes both the peak infected fraction and the timing and persistence of worried-well pressure. A cautious scenario can therefore require a lower but broader capacity response, while high contact requires an earlier and sharper response. The ratio figure shows that non-infected concern can dominate the modelled state composition early, although its contribution to demand is discounted by the baseline service probability.</w:t>
       </w:r>
     </w:p>
     <w:p>
@@ -2953,7 +2960,7 @@
           <w:b w:val="0"/>
           <w:i w:val="0"/>
         </w:rPr>
-        <w:t>Second, capacity should include an uncertainty buffer when shortage carries more weight than unused slots. The buffer is not a fixed number of places: it scales with the day-specific distribution, whose spread is proportional to conditional mean under the implemented coefficient-of-variation model. Increasing uncertainty raises mismatch cost even after capacity is optimized. Third, the shortage-to-overage ratio governs the appropriate service level. Mean-demand planning is particularly unsuitable under asymmetric costs, whereas balanced costs make the median-based and mean-based rules close enough that finite-sample noise can determine their ordering. Preserving the small negative balanced-cost result is important because suppressing it would overstate consistency.</w:t>
+        <w:t>Capacity should include an uncertainty buffer when shortage carries more weight than unused slots. Rather than adding a fixed number of places, the buffer scales with the day-specific distribution, whose spread is proportional to conditional mean under the implemented coefficient-of-variation model. Increasing uncertainty raises mismatch cost even after optimization. The shortage-to-overage ratio governs the appropriate service level: mean-demand planning is unsuitable under asymmetric costs, whereas balanced costs make the median-based and mean-based rules close enough for finite-sample noise to determine their ordering. The small negative balanced-cost result is retained to avoid overstating consistency.</w:t>
       </w:r>
     </w:p>
     <w:p>
@@ -2989,7 +2996,7 @@
           <w:b w:val="0"/>
           <w:i w:val="0"/>
         </w:rPr>
-        <w:t>Two implementation edge cases sit outside the project domain and should be distinguished from those substantive limitations. Demand and capacity are validated as non-negative integers only within the signed 64-bit arithmetic range; larger inputs are rejected rather than analysed. Separately, extremely disproportionate positive finite cost ratios can approach floating-point precision limits and require numerical checking before interpretation. Neither issue affects the recorded coursework scenarios, but both define the safe computational boundary. Finally, all policy comparisons are finite-sample out-of-sample evidence. Seeds make the reported experiment reproducible, not universal; alternative draws would produce small numerical changes, especially where competing rules are nearly equivalent.</w:t>
+        <w:t>All policy comparisons are finite-sample out-of-sample evidence. Fixed seeds make the reported experiment reproducible, not universal; alternative draws would produce small numerical changes, especially where competing rules are nearly equivalent.</w:t>
       </w:r>
     </w:p>
     <w:p>
@@ -3015,20 +3022,13 @@
           <w:b w:val="0"/>
           <w:i w:val="0"/>
         </w:rPr>
-        <w:t>The principal operational lesson is therefore conditional rather than prescriptive. Representing worried-well behaviour can materially change when capacity is needed, but the size of the response depends on assumed service seeking, uncertainty, and costs. The experiment provides a reproducible bridge from behavioural compartments to a daily newsvendor decision. It does not establish a clinical schedule for any provider. Empirical calibration, resource disaggregation, and multi-period constraints would be required before the framework could support a real deployment decision.</w:t>
-      </w:r>
-    </w:p>
-    <w:p>
-      <w:pPr>
-        <w:spacing w:after="0"/>
-      </w:pPr>
-      <w:r>
-        <w:br w:type="page"/>
+        <w:t>Worried-well behaviour can materially change when capacity is needed, but the response depends on assumed service seeking, uncertainty, and costs. The model links behavioural compartments to a daily newsvendor decision; it is not a clinical schedule. Deployment would require empirical calibration, disaggregated resources, and multi-period constraints.</w:t>
       </w:r>
     </w:p>
     <w:p>
       <w:pPr>
         <w:pStyle w:val="Heading1"/>
+        <w:pageBreakBefore/>
       </w:pPr>
       <w:r>
         <w:t>References</w:t>

</xml_diff>